<commit_message>
Integration du CV au profil de reference et creation du suivi des candidatures
Co-authored-by: arena-agent <297053741+arena-agent@users.noreply.github.com>
</commit_message>
<xml_diff>
--- a/Prompts de référence.docx
+++ b/Prompts de référence.docx
@@ -798,39 +798,106 @@
         <w:rPr>
           <w:b w:val="0"/>
         </w:rPr>
-        <w:t>1.2 Éléments à compléter avec ton CV (à me transmettre)</w:t>
+        <w:t>1.2 Éléments vérifiés — issus de mon CV (« Marie Edith (1).pdf »)</w:t>
       </w:r>
     </w:p>
     <w:p>
-      <w:pPr>
-        <w:ind w:left="283"/>
+      <w:r>
+        <w:rPr>
+          <w:b/>
+        </w:rPr>
+        <w:t>État civil et contact</w:t>
+      </w:r>
+    </w:p>
+    <w:p>
+      <w:pPr>
+        <w:pStyle w:val="ListBullet"/>
+        <w:spacing w:after="40"/>
+        <w:ind w:left="397"/>
       </w:pPr>
       <w:r>
         <w:rPr>
           <w:b w:val="0"/>
-          <w:i/>
-          <w:color w:val="555555"/>
-          <w:sz w:val="19"/>
-        </w:rPr>
-        <w:t xml:space="preserve">Tant que ce tableau est vide, </w:t>
+        </w:rPr>
+        <w:t xml:space="preserve">Nom : </w:t>
       </w:r>
       <w:r>
         <w:rPr>
           <w:b/>
-          <w:i/>
-          <w:color w:val="555555"/>
-          <w:sz w:val="19"/>
-        </w:rPr>
-        <w:t>aucun CV ni lettre ne doit être rédigé</w:t>
+        </w:rPr>
+        <w:t>MARIE EDITH R. A. M. GNACADJA</w:t>
       </w:r>
       <w:r>
         <w:rPr>
           <w:b w:val="0"/>
-          <w:i/>
-          <w:color w:val="555555"/>
-          <w:sz w:val="19"/>
-        </w:rPr>
-        <w:t>. Aucune information ne sera inventée.</w:t>
+        </w:rPr>
+        <w:t xml:space="preserve"> (usage : Marie-Edith GNACADJA)</w:t>
+      </w:r>
+    </w:p>
+    <w:p>
+      <w:pPr>
+        <w:pStyle w:val="ListBullet"/>
+        <w:spacing w:after="40"/>
+        <w:ind w:left="397"/>
+      </w:pPr>
+      <w:r>
+        <w:rPr>
+          <w:b w:val="0"/>
+        </w:rPr>
+        <w:t xml:space="preserve">Titre figurant au CV : </w:t>
+      </w:r>
+      <w:r>
+        <w:rPr>
+          <w:b/>
+        </w:rPr>
+        <w:t>Ingénieur en Biologie Médicale</w:t>
+      </w:r>
+    </w:p>
+    <w:p>
+      <w:pPr>
+        <w:pStyle w:val="ListBullet"/>
+        <w:spacing w:after="40"/>
+        <w:ind w:left="397"/>
+      </w:pPr>
+      <w:r>
+        <w:rPr>
+          <w:b w:val="0"/>
+        </w:rPr>
+        <w:t>E-mail : edithgnaca1@gmail.com — Téléphone : +229 62 07 56 06</w:t>
+      </w:r>
+    </w:p>
+    <w:p>
+      <w:pPr>
+        <w:pStyle w:val="ListBullet"/>
+        <w:spacing w:after="40"/>
+        <w:ind w:left="397"/>
+      </w:pPr>
+      <w:r>
+        <w:rPr>
+          <w:b w:val="0"/>
+        </w:rPr>
+        <w:t>Résidence : Womey, Calavi (Abomey-Calavi, Bénin)</w:t>
+      </w:r>
+    </w:p>
+    <w:p>
+      <w:pPr>
+        <w:pStyle w:val="ListBullet"/>
+        <w:spacing w:after="40"/>
+        <w:ind w:left="397"/>
+      </w:pPr>
+      <w:r>
+        <w:rPr>
+          <w:b w:val="0"/>
+        </w:rPr>
+        <w:t>Intitulés de profil utilisés dans le CV : chercheure stagiaire en microbiologie moléculaire et médicale ; graphiste ; nutritionniste santé publique</w:t>
+      </w:r>
+    </w:p>
+    <w:p>
+      <w:r>
+        <w:rPr>
+          <w:b/>
+        </w:rPr>
+        <w:t>Formations</w:t>
       </w:r>
     </w:p>
     <w:tbl>
@@ -841,13 +908,14 @@
         <w:tblLook w:firstColumn="1" w:firstRow="1" w:lastColumn="0" w:lastRow="0" w:noHBand="0" w:noVBand="1" w:val="04A0"/>
       </w:tblPr>
       <w:tblGrid>
-        <w:gridCol w:w="4986"/>
-        <w:gridCol w:w="4986"/>
+        <w:gridCol w:w="3324"/>
+        <w:gridCol w:w="3324"/>
+        <w:gridCol w:w="3324"/>
       </w:tblGrid>
       <w:tr>
         <w:tc>
           <w:tcPr>
-            <w:tcW w:type="dxa" w:w="4986"/>
+            <w:tcW w:type="dxa" w:w="3324"/>
             <w:shd w:val="clear" w:color="auto" w:fill="1F4E79"/>
             <w:tcBorders>
               <w:top w:val="single" w:sz="4" w:space="0" w:color="BFBFBF"/>
@@ -866,13 +934,13 @@
                 <w:color w:val="FFFFFF"/>
                 <w:sz w:val="17"/>
               </w:rPr>
-              <w:t>Catégorie</w:t>
+              <w:t>Période</w:t>
             </w:r>
           </w:p>
         </w:tc>
         <w:tc>
           <w:tcPr>
-            <w:tcW w:type="dxa" w:w="4986"/>
+            <w:tcW w:type="dxa" w:w="3324"/>
             <w:shd w:val="clear" w:color="auto" w:fill="1F4E79"/>
             <w:tcBorders>
               <w:top w:val="single" w:sz="4" w:space="0" w:color="BFBFBF"/>
@@ -891,7 +959,32 @@
                 <w:color w:val="FFFFFF"/>
                 <w:sz w:val="17"/>
               </w:rPr>
-              <w:t>À renseigner</w:t>
+              <w:t>Diplôme / certification</w:t>
+            </w:r>
+          </w:p>
+        </w:tc>
+        <w:tc>
+          <w:tcPr>
+            <w:tcW w:type="dxa" w:w="3324"/>
+            <w:shd w:val="clear" w:color="auto" w:fill="1F4E79"/>
+            <w:tcBorders>
+              <w:top w:val="single" w:sz="4" w:space="0" w:color="BFBFBF"/>
+              <w:left w:val="single" w:sz="4" w:space="0" w:color="BFBFBF"/>
+              <w:bottom w:val="single" w:sz="4" w:space="0" w:color="BFBFBF"/>
+              <w:right w:val="single" w:sz="4" w:space="0" w:color="BFBFBF"/>
+            </w:tcBorders>
+          </w:tcPr>
+          <w:p>
+            <w:pPr>
+              <w:spacing w:after="40" w:before="40"/>
+            </w:pPr>
+            <w:r>
+              <w:rPr>
+                <w:b/>
+                <w:color w:val="FFFFFF"/>
+                <w:sz w:val="17"/>
+              </w:rPr>
+              <w:t>Établissement</w:t>
             </w:r>
           </w:p>
         </w:tc>
@@ -899,7 +992,7 @@
       <w:tr>
         <w:tc>
           <w:tcPr>
-            <w:tcW w:type="dxa" w:w="4986"/>
+            <w:tcW w:type="dxa" w:w="3324"/>
             <w:shd w:val="clear" w:color="auto" w:fill="FFFFFF"/>
             <w:tcBorders>
               <w:top w:val="single" w:sz="4" w:space="0" w:color="BFBFBF"/>
@@ -917,13 +1010,13 @@
                 <w:b w:val="0"/>
                 <w:sz w:val="17"/>
               </w:rPr>
-              <w:t>État civil / contact</w:t>
+              <w:t>2018-2019</w:t>
             </w:r>
           </w:p>
         </w:tc>
         <w:tc>
           <w:tcPr>
-            <w:tcW w:type="dxa" w:w="4986"/>
+            <w:tcW w:type="dxa" w:w="3324"/>
             <w:shd w:val="clear" w:color="auto" w:fill="FFFFFF"/>
             <w:tcBorders>
               <w:top w:val="single" w:sz="4" w:space="0" w:color="BFBFBF"/>
@@ -941,7 +1034,31 @@
                 <w:b w:val="0"/>
                 <w:sz w:val="17"/>
               </w:rPr>
-              <w:t>Nom, prénom, date de naissance, téléphone, e-mail, commune de résidence, nationalité, permis</w:t>
+              <w:t>Baccalauréat D</w:t>
+            </w:r>
+          </w:p>
+        </w:tc>
+        <w:tc>
+          <w:tcPr>
+            <w:tcW w:type="dxa" w:w="3324"/>
+            <w:shd w:val="clear" w:color="auto" w:fill="FFFFFF"/>
+            <w:tcBorders>
+              <w:top w:val="single" w:sz="4" w:space="0" w:color="BFBFBF"/>
+              <w:left w:val="single" w:sz="4" w:space="0" w:color="BFBFBF"/>
+              <w:bottom w:val="single" w:sz="4" w:space="0" w:color="BFBFBF"/>
+              <w:right w:val="single" w:sz="4" w:space="0" w:color="BFBFBF"/>
+            </w:tcBorders>
+          </w:tcPr>
+          <w:p>
+            <w:pPr>
+              <w:spacing w:after="40" w:before="40"/>
+            </w:pPr>
+            <w:r>
+              <w:rPr>
+                <w:b w:val="0"/>
+                <w:sz w:val="17"/>
+              </w:rPr>
+              <w:t>Collège Catholique St Augustin</w:t>
             </w:r>
           </w:p>
         </w:tc>
@@ -949,7 +1066,7 @@
       <w:tr>
         <w:tc>
           <w:tcPr>
-            <w:tcW w:type="dxa" w:w="4986"/>
+            <w:tcW w:type="dxa" w:w="3324"/>
             <w:shd w:val="clear" w:color="auto" w:fill="F2F7FB"/>
             <w:tcBorders>
               <w:top w:val="single" w:sz="4" w:space="0" w:color="BFBFBF"/>
@@ -967,13 +1084,13 @@
                 <w:b w:val="0"/>
                 <w:sz w:val="17"/>
               </w:rPr>
-              <w:t>Formation antérieure</w:t>
+              <w:t>2019-2020</w:t>
             </w:r>
           </w:p>
         </w:tc>
         <w:tc>
           <w:tcPr>
-            <w:tcW w:type="dxa" w:w="4986"/>
+            <w:tcW w:type="dxa" w:w="3324"/>
             <w:shd w:val="clear" w:color="auto" w:fill="F2F7FB"/>
             <w:tcBorders>
               <w:top w:val="single" w:sz="4" w:space="0" w:color="BFBFBF"/>
@@ -991,7 +1108,31 @@
                 <w:b w:val="0"/>
                 <w:sz w:val="17"/>
               </w:rPr>
-              <w:t>Licence / baccalauréat, établissements, années, mentions</w:t>
+              <w:t>Formation en Graphisme</w:t>
+            </w:r>
+          </w:p>
+        </w:tc>
+        <w:tc>
+          <w:tcPr>
+            <w:tcW w:type="dxa" w:w="3324"/>
+            <w:shd w:val="clear" w:color="auto" w:fill="F2F7FB"/>
+            <w:tcBorders>
+              <w:top w:val="single" w:sz="4" w:space="0" w:color="BFBFBF"/>
+              <w:left w:val="single" w:sz="4" w:space="0" w:color="BFBFBF"/>
+              <w:bottom w:val="single" w:sz="4" w:space="0" w:color="BFBFBF"/>
+              <w:right w:val="single" w:sz="4" w:space="0" w:color="BFBFBF"/>
+            </w:tcBorders>
+          </w:tcPr>
+          <w:p>
+            <w:pPr>
+              <w:spacing w:after="40" w:before="40"/>
+            </w:pPr>
+            <w:r>
+              <w:rPr>
+                <w:b w:val="0"/>
+                <w:sz w:val="17"/>
+              </w:rPr>
+              <w:t>EIGB – Cotonou</w:t>
             </w:r>
           </w:p>
         </w:tc>
@@ -999,7 +1140,7 @@
       <w:tr>
         <w:tc>
           <w:tcPr>
-            <w:tcW w:type="dxa" w:w="4986"/>
+            <w:tcW w:type="dxa" w:w="3324"/>
             <w:shd w:val="clear" w:color="auto" w:fill="FFFFFF"/>
             <w:tcBorders>
               <w:top w:val="single" w:sz="4" w:space="0" w:color="BFBFBF"/>
@@ -1017,13 +1158,13 @@
                 <w:b w:val="0"/>
                 <w:sz w:val="17"/>
               </w:rPr>
-              <w:t>Formation en graphisme</w:t>
+              <w:t>2020-2023</w:t>
             </w:r>
           </w:p>
         </w:tc>
         <w:tc>
           <w:tcPr>
-            <w:tcW w:type="dxa" w:w="4986"/>
+            <w:tcW w:type="dxa" w:w="3324"/>
             <w:shd w:val="clear" w:color="auto" w:fill="FFFFFF"/>
             <w:tcBorders>
               <w:top w:val="single" w:sz="4" w:space="0" w:color="BFBFBF"/>
@@ -1041,7 +1182,31 @@
                 <w:b w:val="0"/>
                 <w:sz w:val="17"/>
               </w:rPr>
-              <w:t>Intitulé, organisme, durée, année, logiciels maîtrisés (Adobe, Canva, etc.)</w:t>
+              <w:t>Licence en Biologie Médicale</w:t>
+            </w:r>
+          </w:p>
+        </w:tc>
+        <w:tc>
+          <w:tcPr>
+            <w:tcW w:type="dxa" w:w="3324"/>
+            <w:shd w:val="clear" w:color="auto" w:fill="FFFFFF"/>
+            <w:tcBorders>
+              <w:top w:val="single" w:sz="4" w:space="0" w:color="BFBFBF"/>
+              <w:left w:val="single" w:sz="4" w:space="0" w:color="BFBFBF"/>
+              <w:bottom w:val="single" w:sz="4" w:space="0" w:color="BFBFBF"/>
+              <w:right w:val="single" w:sz="4" w:space="0" w:color="BFBFBF"/>
+            </w:tcBorders>
+          </w:tcPr>
+          <w:p>
+            <w:pPr>
+              <w:spacing w:after="40" w:before="40"/>
+            </w:pPr>
+            <w:r>
+              <w:rPr>
+                <w:b w:val="0"/>
+                <w:sz w:val="17"/>
+              </w:rPr>
+              <w:t>IRGIB-AFRICA – Cotonou</w:t>
             </w:r>
           </w:p>
         </w:tc>
@@ -1049,7 +1214,7 @@
       <w:tr>
         <w:tc>
           <w:tcPr>
-            <w:tcW w:type="dxa" w:w="4986"/>
+            <w:tcW w:type="dxa" w:w="3324"/>
             <w:shd w:val="clear" w:color="auto" w:fill="F2F7FB"/>
             <w:tcBorders>
               <w:top w:val="single" w:sz="4" w:space="0" w:color="BFBFBF"/>
@@ -1067,13 +1232,13 @@
                 <w:b w:val="0"/>
                 <w:sz w:val="17"/>
               </w:rPr>
-              <w:t>Stages</w:t>
+              <w:t>2023-2024</w:t>
             </w:r>
           </w:p>
         </w:tc>
         <w:tc>
           <w:tcPr>
-            <w:tcW w:type="dxa" w:w="4986"/>
+            <w:tcW w:type="dxa" w:w="3324"/>
             <w:shd w:val="clear" w:color="auto" w:fill="F2F7FB"/>
             <w:tcBorders>
               <w:top w:val="single" w:sz="4" w:space="0" w:color="BFBFBF"/>
@@ -1091,7 +1256,31 @@
                 <w:b w:val="0"/>
                 <w:sz w:val="17"/>
               </w:rPr>
-              <w:t>Structure, intitulé, dates, lieu, missions, encadrant, réalisations</w:t>
+              <w:t>Certification en Microbiologie Basic (délivrée par l'OMS)</w:t>
+            </w:r>
+          </w:p>
+        </w:tc>
+        <w:tc>
+          <w:tcPr>
+            <w:tcW w:type="dxa" w:w="3324"/>
+            <w:shd w:val="clear" w:color="auto" w:fill="F2F7FB"/>
+            <w:tcBorders>
+              <w:top w:val="single" w:sz="4" w:space="0" w:color="BFBFBF"/>
+              <w:left w:val="single" w:sz="4" w:space="0" w:color="BFBFBF"/>
+              <w:bottom w:val="single" w:sz="4" w:space="0" w:color="BFBFBF"/>
+              <w:right w:val="single" w:sz="4" w:space="0" w:color="BFBFBF"/>
+            </w:tcBorders>
+          </w:tcPr>
+          <w:p>
+            <w:pPr>
+              <w:spacing w:after="40" w:before="40"/>
+            </w:pPr>
+            <w:r>
+              <w:rPr>
+                <w:b w:val="0"/>
+                <w:sz w:val="17"/>
+              </w:rPr>
+              <w:t>URMAPHA</w:t>
             </w:r>
           </w:p>
         </w:tc>
@@ -1099,7 +1288,7 @@
       <w:tr>
         <w:tc>
           <w:tcPr>
-            <w:tcW w:type="dxa" w:w="4986"/>
+            <w:tcW w:type="dxa" w:w="3324"/>
             <w:shd w:val="clear" w:color="auto" w:fill="FFFFFF"/>
             <w:tcBorders>
               <w:top w:val="single" w:sz="4" w:space="0" w:color="BFBFBF"/>
@@ -1117,13 +1306,13 @@
                 <w:b w:val="0"/>
                 <w:sz w:val="17"/>
               </w:rPr>
-              <w:t>Expériences professionnelles</w:t>
+              <w:t>Oct. 2024 – mai 2025</w:t>
             </w:r>
           </w:p>
         </w:tc>
         <w:tc>
           <w:tcPr>
-            <w:tcW w:type="dxa" w:w="4986"/>
+            <w:tcW w:type="dxa" w:w="3324"/>
             <w:shd w:val="clear" w:color="auto" w:fill="FFFFFF"/>
             <w:tcBorders>
               <w:top w:val="single" w:sz="4" w:space="0" w:color="BFBFBF"/>
@@ -1141,7 +1330,31 @@
                 <w:b w:val="0"/>
                 <w:sz w:val="17"/>
               </w:rPr>
-              <w:t>Postes, employeurs, dates, missions</w:t>
+              <w:t>Diplôme Universitaire en Éducation Nutritionnelle pour l'Afrique Francophone (en ligne)</w:t>
+            </w:r>
+          </w:p>
+        </w:tc>
+        <w:tc>
+          <w:tcPr>
+            <w:tcW w:type="dxa" w:w="3324"/>
+            <w:shd w:val="clear" w:color="auto" w:fill="FFFFFF"/>
+            <w:tcBorders>
+              <w:top w:val="single" w:sz="4" w:space="0" w:color="BFBFBF"/>
+              <w:left w:val="single" w:sz="4" w:space="0" w:color="BFBFBF"/>
+              <w:bottom w:val="single" w:sz="4" w:space="0" w:color="BFBFBF"/>
+              <w:right w:val="single" w:sz="4" w:space="0" w:color="BFBFBF"/>
+            </w:tcBorders>
+          </w:tcPr>
+          <w:p>
+            <w:pPr>
+              <w:spacing w:after="40" w:before="40"/>
+            </w:pPr>
+            <w:r>
+              <w:rPr>
+                <w:b w:val="0"/>
+                <w:sz w:val="17"/>
+              </w:rPr>
+              <w:t>Université Senghor</w:t>
             </w:r>
           </w:p>
         </w:tc>
@@ -1149,7 +1362,7 @@
       <w:tr>
         <w:tc>
           <w:tcPr>
-            <w:tcW w:type="dxa" w:w="4986"/>
+            <w:tcW w:type="dxa" w:w="3324"/>
             <w:shd w:val="clear" w:color="auto" w:fill="F2F7FB"/>
             <w:tcBorders>
               <w:top w:val="single" w:sz="4" w:space="0" w:color="BFBFBF"/>
@@ -1167,13 +1380,13 @@
                 <w:b w:val="0"/>
                 <w:sz w:val="17"/>
               </w:rPr>
-              <w:t>Engagements associatifs / bénévolat</w:t>
+              <w:t>2024-2025</w:t>
             </w:r>
           </w:p>
         </w:tc>
         <w:tc>
           <w:tcPr>
-            <w:tcW w:type="dxa" w:w="4986"/>
+            <w:tcW w:type="dxa" w:w="3324"/>
             <w:shd w:val="clear" w:color="auto" w:fill="F2F7FB"/>
             <w:tcBorders>
               <w:top w:val="single" w:sz="4" w:space="0" w:color="BFBFBF"/>
@@ -1191,7 +1404,31 @@
                 <w:b w:val="0"/>
                 <w:sz w:val="17"/>
               </w:rPr>
-              <w:t>Structure, rôle, dates</w:t>
+              <w:t>Master 1 Nutrition et santé des populations</w:t>
+            </w:r>
+          </w:p>
+        </w:tc>
+        <w:tc>
+          <w:tcPr>
+            <w:tcW w:type="dxa" w:w="3324"/>
+            <w:shd w:val="clear" w:color="auto" w:fill="F2F7FB"/>
+            <w:tcBorders>
+              <w:top w:val="single" w:sz="4" w:space="0" w:color="BFBFBF"/>
+              <w:left w:val="single" w:sz="4" w:space="0" w:color="BFBFBF"/>
+              <w:bottom w:val="single" w:sz="4" w:space="0" w:color="BFBFBF"/>
+              <w:right w:val="single" w:sz="4" w:space="0" w:color="BFBFBF"/>
+            </w:tcBorders>
+          </w:tcPr>
+          <w:p>
+            <w:pPr>
+              <w:spacing w:after="40" w:before="40"/>
+            </w:pPr>
+            <w:r>
+              <w:rPr>
+                <w:b w:val="0"/>
+                <w:sz w:val="17"/>
+              </w:rPr>
+              <w:t>IRSP – Ouidah</w:t>
             </w:r>
           </w:p>
         </w:tc>
@@ -1199,7 +1436,7 @@
       <w:tr>
         <w:tc>
           <w:tcPr>
-            <w:tcW w:type="dxa" w:w="4986"/>
+            <w:tcW w:type="dxa" w:w="3324"/>
             <w:shd w:val="clear" w:color="auto" w:fill="FFFFFF"/>
             <w:tcBorders>
               <w:top w:val="single" w:sz="4" w:space="0" w:color="BFBFBF"/>
@@ -1217,13 +1454,13 @@
                 <w:b w:val="0"/>
                 <w:sz w:val="17"/>
               </w:rPr>
-              <w:t>Compétences techniques</w:t>
+              <w:t>2025-2026</w:t>
             </w:r>
           </w:p>
         </w:tc>
         <w:tc>
           <w:tcPr>
-            <w:tcW w:type="dxa" w:w="4986"/>
+            <w:tcW w:type="dxa" w:w="3324"/>
             <w:shd w:val="clear" w:color="auto" w:fill="FFFFFF"/>
             <w:tcBorders>
               <w:top w:val="single" w:sz="4" w:space="0" w:color="BFBFBF"/>
@@ -1241,7 +1478,468 @@
                 <w:b w:val="0"/>
                 <w:sz w:val="17"/>
               </w:rPr>
-              <w:t>Outils de collecte et d'analyse (KoboToolbox, ODK, Excel, SPSS, R, Epi Info, DHIS2…), bureautique, PAO</w:t>
+              <w:t>Master 2 Nutrition et santé des populations</w:t>
+            </w:r>
+          </w:p>
+        </w:tc>
+        <w:tc>
+          <w:tcPr>
+            <w:tcW w:type="dxa" w:w="3324"/>
+            <w:shd w:val="clear" w:color="auto" w:fill="FFFFFF"/>
+            <w:tcBorders>
+              <w:top w:val="single" w:sz="4" w:space="0" w:color="BFBFBF"/>
+              <w:left w:val="single" w:sz="4" w:space="0" w:color="BFBFBF"/>
+              <w:bottom w:val="single" w:sz="4" w:space="0" w:color="BFBFBF"/>
+              <w:right w:val="single" w:sz="4" w:space="0" w:color="BFBFBF"/>
+            </w:tcBorders>
+          </w:tcPr>
+          <w:p>
+            <w:pPr>
+              <w:spacing w:after="40" w:before="40"/>
+            </w:pPr>
+            <w:r>
+              <w:rPr>
+                <w:b w:val="0"/>
+                <w:sz w:val="17"/>
+              </w:rPr>
+              <w:t>IRSP – Ouidah</w:t>
+            </w:r>
+          </w:p>
+        </w:tc>
+      </w:tr>
+    </w:tbl>
+    <w:p/>
+    <w:p>
+      <w:r>
+        <w:rPr>
+          <w:b/>
+        </w:rPr>
+        <w:t>Stages et expériences</w:t>
+      </w:r>
+    </w:p>
+    <w:p>
+      <w:r>
+        <w:rPr>
+          <w:b w:val="0"/>
+        </w:rPr>
+        <w:t xml:space="preserve">1. </w:t>
+      </w:r>
+      <w:r>
+        <w:rPr>
+          <w:b/>
+        </w:rPr>
+        <w:t>Stage académique – Zone sanitaire Abomey-Calavi / Sô-Ava</w:t>
+      </w:r>
+      <w:r>
+        <w:rPr>
+          <w:b w:val="0"/>
+        </w:rPr>
+        <w:t xml:space="preserve"> (communauté), mai 2026 : conduite d'une étude interventionnelle sur l'hygiène hydro-fécale et alimentaire ; échantillonnage ; collecte de données ; observations ménagères ; analyse des scores CAPP ; comparaison avant/après intervention ; formulation de recommandations en santé publique.</w:t>
+      </w:r>
+    </w:p>
+    <w:p>
+      <w:r>
+        <w:rPr>
+          <w:b w:val="0"/>
+        </w:rPr>
+        <w:t xml:space="preserve">2. </w:t>
+      </w:r>
+      <w:r>
+        <w:rPr>
+          <w:b/>
+        </w:rPr>
+        <w:t>Stage académique – Analyse de situation nutritionnelle, zone sanitaire Aplahoué–Djakotomey–Dogbo (ADD)</w:t>
+      </w:r>
+      <w:r>
+        <w:rPr>
+          <w:b w:val="0"/>
+        </w:rPr>
+        <w:t>, février 2026 : analyse de situation nutritionnelle ; collecte et analyse de données DHIS2, annuaires statistiques et PDC ; enquêtes qualitatives (entretiens et observations de terrain) ; analyse des indicateurs nutritionnels et SWOT ; priorisation des problèmes de santé ; rédaction du rapport.</w:t>
+      </w:r>
+    </w:p>
+    <w:p>
+      <w:r>
+        <w:rPr>
+          <w:b w:val="0"/>
+        </w:rPr>
+        <w:t xml:space="preserve">3. </w:t>
+      </w:r>
+      <w:r>
+        <w:rPr>
+          <w:b/>
+        </w:rPr>
+        <w:t>Stage académique – Direction départementale de la santé du Littoral (DDS Littoral)</w:t>
+      </w:r>
+      <w:r>
+        <w:rPr>
+          <w:b w:val="0"/>
+        </w:rPr>
+        <w:t>, septembre 2025 : analyse de situation sanitaire départementale ; identification et priorisation des problèmes de santé publique (couverture vaccinale) ; exploitation de documents de planification (lettre de mission, AOF) ; entretiens avec les responsables des divisions Santé publique et riposte, et Santé communautaire ; analyse SWOT ; élaboration d'un plan opérationnel avec objectifs SMART, stratégies, activités et indicateurs ; initiation à la planification, au suivi et à l'évaluation ; rédaction du rapport.</w:t>
+      </w:r>
+    </w:p>
+    <w:p>
+      <w:r>
+        <w:rPr>
+          <w:b w:val="0"/>
+        </w:rPr>
+        <w:t xml:space="preserve">4. </w:t>
+      </w:r>
+      <w:r>
+        <w:rPr>
+          <w:b/>
+        </w:rPr>
+        <w:t>URMAPHA (Unité de Recherche en Microbiologie Appliquée et Pharmacopée), 2023-2024</w:t>
+      </w:r>
+    </w:p>
+    <w:p>
+      <w:pPr>
+        <w:pStyle w:val="ListBullet"/>
+        <w:spacing w:after="40"/>
+        <w:ind w:left="397"/>
+      </w:pPr>
+      <w:r>
+        <w:rPr>
+          <w:b w:val="0"/>
+        </w:rPr>
+        <w:t>Stagiaire en microbiologie moléculaire et médicale : préparation et traitement d'échantillons biologiques ; culture et entretien de micro-organismes ; tenue de notes de laboratoire et rédaction de rapports ; respect des normes de sécurité et de qualité.</w:t>
+      </w:r>
+    </w:p>
+    <w:p>
+      <w:pPr>
+        <w:pStyle w:val="ListBullet"/>
+        <w:spacing w:after="40"/>
+        <w:ind w:left="397"/>
+      </w:pPr>
+      <w:r>
+        <w:rPr>
+          <w:b w:val="0"/>
+        </w:rPr>
+        <w:t>Gestionnaire du volet administratif : archivage et transmission des dossiers, rédaction et enregistrement de courriers, préparation de rapports d'activités et de rapports de qualité, documentation des procédures et protocoles.</w:t>
+      </w:r>
+    </w:p>
+    <w:p>
+      <w:pPr>
+        <w:pStyle w:val="ListBullet"/>
+        <w:spacing w:after="40"/>
+        <w:ind w:left="397"/>
+      </w:pPr>
+      <w:r>
+        <w:rPr>
+          <w:b w:val="0"/>
+        </w:rPr>
+        <w:t>Participation aux activités de l'unité : organisation d'une activité sur les revues et conférences prédatrices ; organisation de l'atelier du Programme de leadership scientifique au Bénin (leadership scientifique pour le développement durable et l'innovation technologique).</w:t>
+      </w:r>
+    </w:p>
+    <w:p>
+      <w:pPr>
+        <w:pStyle w:val="ListBullet"/>
+        <w:spacing w:after="40"/>
+        <w:ind w:left="397"/>
+      </w:pPr>
+      <w:r>
+        <w:rPr>
+          <w:b/>
+        </w:rPr>
+        <w:t>Enquêtrice</w:t>
+      </w:r>
+      <w:r>
+        <w:rPr>
+          <w:b w:val="0"/>
+        </w:rPr>
+        <w:t xml:space="preserve"> dans le cadre du projet Minangan : enquête sur la médecine traditionnelle au Bénin (pratiques, interactions et perspectives liées à l'utilisation des plantes médicinales).</w:t>
+      </w:r>
+    </w:p>
+    <w:p>
+      <w:r>
+        <w:rPr>
+          <w:b/>
+        </w:rPr>
+        <w:t>Compétences déclarées (niveaux auto-évalués dans le CV — à conserver tels quels)</w:t>
+      </w:r>
+    </w:p>
+    <w:p>
+      <w:pPr>
+        <w:pStyle w:val="ListBullet"/>
+        <w:spacing w:after="40"/>
+        <w:ind w:left="397"/>
+      </w:pPr>
+      <w:r>
+        <w:rPr>
+          <w:b w:val="0"/>
+        </w:rPr>
+        <w:t xml:space="preserve">✓✓✓ : santé publique, nutrition et épidémiologie ; conception et conduite d'enquêtes de terrain ; collecte, gestion et contrôle qualité des données ; rédaction scientifique, rapports d'activités et comptes rendus ; élaboration de questionnaires et outils de collecte ; techniques de laboratoire biomédical ; compréhension et application des principes scientifiques ; rigueur, précision et respect des procédures de qualité ; </w:t>
+      </w:r>
+      <w:r>
+        <w:rPr>
+          <w:b/>
+        </w:rPr>
+        <w:t>KoboCollect</w:t>
+      </w:r>
+      <w:r>
+        <w:rPr>
+          <w:b w:val="0"/>
+        </w:rPr>
+        <w:t xml:space="preserve"> ; </w:t>
+      </w:r>
+      <w:r>
+        <w:rPr>
+          <w:b/>
+        </w:rPr>
+        <w:t>Canva</w:t>
+      </w:r>
+      <w:r>
+        <w:rPr>
+          <w:b w:val="0"/>
+        </w:rPr>
+        <w:t xml:space="preserve"> (affiches, posters, supports de communication) ; Word ; PowerPoint ; communication écrite et orale ; communication scientifique et présentation de résultats ; </w:t>
+      </w:r>
+      <w:r>
+        <w:rPr>
+          <w:b/>
+        </w:rPr>
+        <w:t>conception de supports d'éducation et de sensibilisation en santé</w:t>
+      </w:r>
+      <w:r>
+        <w:rPr>
+          <w:b w:val="0"/>
+        </w:rPr>
+        <w:t xml:space="preserve"> ; travail en équipe et collaboration multidisciplinaire ; sens de l'analyse, esprit critique et résolution de problèmes ; autonomie, disponibilité et respect des délais.</w:t>
+      </w:r>
+    </w:p>
+    <w:p>
+      <w:pPr>
+        <w:pStyle w:val="ListBullet"/>
+        <w:spacing w:after="40"/>
+        <w:ind w:left="397"/>
+      </w:pPr>
+      <w:r>
+        <w:rPr>
+          <w:b w:val="0"/>
+        </w:rPr>
+        <w:t>✓✓ : analyse statistique et interprétation des résultats ; suivi-évaluation des programmes et projets de santé ; Excel ; Stata ; Epi Info ; organisation et coordination des activités de terrain.</w:t>
+      </w:r>
+    </w:p>
+    <w:p>
+      <w:pPr>
+        <w:pStyle w:val="ListBullet"/>
+        <w:spacing w:after="40"/>
+        <w:ind w:left="397"/>
+      </w:pPr>
+      <w:r>
+        <w:rPr>
+          <w:b w:val="0"/>
+        </w:rPr>
+        <w:t>✓ : gestion des situations de crise et adaptation aux imprévus.</w:t>
+      </w:r>
+    </w:p>
+    <w:p>
+      <w:r>
+        <w:rPr>
+          <w:b/>
+        </w:rPr>
+        <w:t>Langues</w:t>
+      </w:r>
+    </w:p>
+    <w:p>
+      <w:pPr>
+        <w:pStyle w:val="ListBullet"/>
+        <w:spacing w:after="40"/>
+        <w:ind w:left="397"/>
+      </w:pPr>
+      <w:r>
+        <w:rPr>
+          <w:b w:val="0"/>
+        </w:rPr>
+        <w:t>Français : expression orale et écrite ✓✓✓</w:t>
+      </w:r>
+    </w:p>
+    <w:p>
+      <w:pPr>
+        <w:pStyle w:val="ListBullet"/>
+        <w:spacing w:after="40"/>
+        <w:ind w:left="397"/>
+      </w:pPr>
+      <w:r>
+        <w:rPr>
+          <w:b w:val="0"/>
+        </w:rPr>
+        <w:t>Anglais : lecture et compréhension de documents scientifiques, expression orale et écrite ✓✓</w:t>
+      </w:r>
+    </w:p>
+    <w:p>
+      <w:pPr>
+        <w:pStyle w:val="ListBullet"/>
+        <w:spacing w:after="40"/>
+        <w:ind w:left="397"/>
+      </w:pPr>
+      <w:r>
+        <w:rPr>
+          <w:b/>
+        </w:rPr>
+        <w:t>Aucune langue nationale ni aucun permis de conduire ne figure au CV</w:t>
+      </w:r>
+      <w:r>
+        <w:rPr>
+          <w:b w:val="0"/>
+        </w:rPr>
+        <w:t xml:space="preserve"> → voir 1.3.</w:t>
+      </w:r>
+    </w:p>
+    <w:p>
+      <w:r>
+        <w:rPr>
+          <w:b/>
+        </w:rPr>
+        <w:t>Références (accord à confirmer avant utilisation)</w:t>
+      </w:r>
+    </w:p>
+    <w:p>
+      <w:pPr>
+        <w:pStyle w:val="ListBullet"/>
+        <w:spacing w:after="40"/>
+        <w:ind w:left="397"/>
+      </w:pPr>
+      <w:r>
+        <w:rPr>
+          <w:b/>
+        </w:rPr>
+        <w:t>Dr Brice Boris LEGBA, PhD</w:t>
+      </w:r>
+      <w:r>
+        <w:rPr>
+          <w:b w:val="0"/>
+        </w:rPr>
+        <w:t xml:space="preserve"> — Chercheur en microbiologie, URMAPha, École Polytechnique d'Abomey-Calavi — legba.brice@gmail.com — +229 66 01 09 41</w:t>
+      </w:r>
+    </w:p>
+    <w:p>
+      <w:pPr>
+        <w:pStyle w:val="ListBullet"/>
+        <w:spacing w:after="40"/>
+        <w:ind w:left="397"/>
+      </w:pPr>
+      <w:r>
+        <w:rPr>
+          <w:b/>
+        </w:rPr>
+        <w:t>Professeure Colette AZANDJEME, MD</w:t>
+      </w:r>
+      <w:r>
+        <w:rPr>
+          <w:b w:val="0"/>
+        </w:rPr>
+        <w:t xml:space="preserve"> — Médecin, Maître de Conférences Agrégée en Santé Publique, IRSP-CAQ, Université d'Abomey-Calavi</w:t>
+      </w:r>
+    </w:p>
+    <w:p>
+      <w:pPr>
+        <w:pStyle w:val="ListBullet"/>
+        <w:spacing w:after="40"/>
+        <w:ind w:left="397"/>
+      </w:pPr>
+      <w:r>
+        <w:rPr>
+          <w:b w:val="0"/>
+        </w:rPr>
+        <w:t>Autres personnes citées dans le mémoire (M. Judicaël TODEDJI, co-directeur ; Dr METONNOU Clémence ; Dr CHABI Chatine, médecin coordonnateur de zone sanitaire) — mobilisables sur accord.</w:t>
+      </w:r>
+    </w:p>
+    <w:p>
+      <w:pPr>
+        <w:pStyle w:val="Heading3"/>
+      </w:pPr>
+      <w:r>
+        <w:rPr>
+          <w:b w:val="0"/>
+        </w:rPr>
+        <w:t>1.3 Points à confirmer (ne jamais les supposer)</w:t>
+      </w:r>
+    </w:p>
+    <w:tbl>
+      <w:tblPr>
+        <w:tblStyle w:val="TableGrid"/>
+        <w:tblW w:type="auto" w:w="0"/>
+        <w:jc w:val="center"/>
+        <w:tblLook w:firstColumn="1" w:firstRow="1" w:lastColumn="0" w:lastRow="0" w:noHBand="0" w:noVBand="1" w:val="04A0"/>
+      </w:tblPr>
+      <w:tblGrid>
+        <w:gridCol w:w="3324"/>
+        <w:gridCol w:w="3324"/>
+        <w:gridCol w:w="3324"/>
+      </w:tblGrid>
+      <w:tr>
+        <w:tc>
+          <w:tcPr>
+            <w:tcW w:type="dxa" w:w="3324"/>
+            <w:shd w:val="clear" w:color="auto" w:fill="1F4E79"/>
+            <w:tcBorders>
+              <w:top w:val="single" w:sz="4" w:space="0" w:color="BFBFBF"/>
+              <w:left w:val="single" w:sz="4" w:space="0" w:color="BFBFBF"/>
+              <w:bottom w:val="single" w:sz="4" w:space="0" w:color="BFBFBF"/>
+              <w:right w:val="single" w:sz="4" w:space="0" w:color="BFBFBF"/>
+            </w:tcBorders>
+          </w:tcPr>
+          <w:p>
+            <w:pPr>
+              <w:spacing w:after="40" w:before="40"/>
+            </w:pPr>
+            <w:r>
+              <w:rPr>
+                <w:b/>
+                <w:color w:val="FFFFFF"/>
+                <w:sz w:val="17"/>
+              </w:rPr>
+              <w:t>Point</w:t>
+            </w:r>
+          </w:p>
+        </w:tc>
+        <w:tc>
+          <w:tcPr>
+            <w:tcW w:type="dxa" w:w="3324"/>
+            <w:shd w:val="clear" w:color="auto" w:fill="1F4E79"/>
+            <w:tcBorders>
+              <w:top w:val="single" w:sz="4" w:space="0" w:color="BFBFBF"/>
+              <w:left w:val="single" w:sz="4" w:space="0" w:color="BFBFBF"/>
+              <w:bottom w:val="single" w:sz="4" w:space="0" w:color="BFBFBF"/>
+              <w:right w:val="single" w:sz="4" w:space="0" w:color="BFBFBF"/>
+            </w:tcBorders>
+          </w:tcPr>
+          <w:p>
+            <w:pPr>
+              <w:spacing w:after="40" w:before="40"/>
+            </w:pPr>
+            <w:r>
+              <w:rPr>
+                <w:b/>
+                <w:color w:val="FFFFFF"/>
+                <w:sz w:val="17"/>
+              </w:rPr>
+              <w:t>Pourquoi c'est sensible</w:t>
+            </w:r>
+          </w:p>
+        </w:tc>
+        <w:tc>
+          <w:tcPr>
+            <w:tcW w:type="dxa" w:w="3324"/>
+            <w:shd w:val="clear" w:color="auto" w:fill="1F4E79"/>
+            <w:tcBorders>
+              <w:top w:val="single" w:sz="4" w:space="0" w:color="BFBFBF"/>
+              <w:left w:val="single" w:sz="4" w:space="0" w:color="BFBFBF"/>
+              <w:bottom w:val="single" w:sz="4" w:space="0" w:color="BFBFBF"/>
+              <w:right w:val="single" w:sz="4" w:space="0" w:color="BFBFBF"/>
+            </w:tcBorders>
+          </w:tcPr>
+          <w:p>
+            <w:pPr>
+              <w:spacing w:after="40" w:before="40"/>
+            </w:pPr>
+            <w:r>
+              <w:rPr>
+                <w:b/>
+                <w:color w:val="FFFFFF"/>
+                <w:sz w:val="17"/>
+              </w:rPr>
+              <w:t>Statut</w:t>
             </w:r>
           </w:p>
         </w:tc>
@@ -1249,7 +1947,88 @@
       <w:tr>
         <w:tc>
           <w:tcPr>
-            <w:tcW w:type="dxa" w:w="4986"/>
+            <w:tcW w:type="dxa" w:w="3324"/>
+            <w:shd w:val="clear" w:color="auto" w:fill="FFFFFF"/>
+            <w:tcBorders>
+              <w:top w:val="single" w:sz="4" w:space="0" w:color="BFBFBF"/>
+              <w:left w:val="single" w:sz="4" w:space="0" w:color="BFBFBF"/>
+              <w:bottom w:val="single" w:sz="4" w:space="0" w:color="BFBFBF"/>
+              <w:right w:val="single" w:sz="4" w:space="0" w:color="BFBFBF"/>
+            </w:tcBorders>
+          </w:tcPr>
+          <w:p>
+            <w:pPr>
+              <w:spacing w:after="40" w:before="40"/>
+            </w:pPr>
+            <w:r>
+              <w:rPr>
+                <w:b w:val="0"/>
+                <w:sz w:val="17"/>
+              </w:rPr>
+              <w:t>Langues nationales (fon, goun, aja…)</w:t>
+            </w:r>
+          </w:p>
+        </w:tc>
+        <w:tc>
+          <w:tcPr>
+            <w:tcW w:type="dxa" w:w="3324"/>
+            <w:shd w:val="clear" w:color="auto" w:fill="FFFFFF"/>
+            <w:tcBorders>
+              <w:top w:val="single" w:sz="4" w:space="0" w:color="BFBFBF"/>
+              <w:left w:val="single" w:sz="4" w:space="0" w:color="BFBFBF"/>
+              <w:bottom w:val="single" w:sz="4" w:space="0" w:color="BFBFBF"/>
+              <w:right w:val="single" w:sz="4" w:space="0" w:color="BFBFBF"/>
+            </w:tcBorders>
+          </w:tcPr>
+          <w:p>
+            <w:pPr>
+              <w:spacing w:after="40" w:before="40"/>
+            </w:pPr>
+            <w:r>
+              <w:rPr>
+                <w:b w:val="0"/>
+                <w:sz w:val="17"/>
+              </w:rPr>
+              <w:t>Fréquemment exigées pour les postes communautaires au Bénin</w:t>
+            </w:r>
+          </w:p>
+        </w:tc>
+        <w:tc>
+          <w:tcPr>
+            <w:tcW w:type="dxa" w:w="3324"/>
+            <w:shd w:val="clear" w:color="auto" w:fill="FFFFFF"/>
+            <w:tcBorders>
+              <w:top w:val="single" w:sz="4" w:space="0" w:color="BFBFBF"/>
+              <w:left w:val="single" w:sz="4" w:space="0" w:color="BFBFBF"/>
+              <w:bottom w:val="single" w:sz="4" w:space="0" w:color="BFBFBF"/>
+              <w:right w:val="single" w:sz="4" w:space="0" w:color="BFBFBF"/>
+            </w:tcBorders>
+          </w:tcPr>
+          <w:p>
+            <w:pPr>
+              <w:spacing w:after="40" w:before="40"/>
+            </w:pPr>
+            <w:r>
+              <w:rPr>
+                <w:b/>
+                <w:sz w:val="17"/>
+              </w:rPr>
+              <w:t>À confirmer</w:t>
+            </w:r>
+            <w:r>
+              <w:rPr>
+                <w:b w:val="0"/>
+                <w:sz w:val="17"/>
+              </w:rPr>
+              <w:t xml:space="preserve"> — ne rien écrire sans réponse</w:t>
+            </w:r>
+          </w:p>
+        </w:tc>
+      </w:tr>
+      <w:tr>
+        <w:tc>
+          <w:tcPr>
+            <w:tcW w:type="dxa" w:w="3324"/>
             <w:shd w:val="clear" w:color="auto" w:fill="F2F7FB"/>
             <w:tcBorders>
               <w:top w:val="single" w:sz="4" w:space="0" w:color="BFBFBF"/>
@@ -1267,13 +2046,13 @@
                 <w:b w:val="0"/>
                 <w:sz w:val="17"/>
               </w:rPr>
-              <w:t>Langues</w:t>
+              <w:t>Permis de conduire / mobilité terrain</w:t>
             </w:r>
           </w:p>
         </w:tc>
         <w:tc>
           <w:tcPr>
-            <w:tcW w:type="dxa" w:w="4986"/>
+            <w:tcW w:type="dxa" w:w="3324"/>
             <w:shd w:val="clear" w:color="auto" w:fill="F2F7FB"/>
             <w:tcBorders>
               <w:top w:val="single" w:sz="4" w:space="0" w:color="BFBFBF"/>
@@ -1291,7 +2070,31 @@
                 <w:b w:val="0"/>
                 <w:sz w:val="17"/>
               </w:rPr>
-              <w:t>Français, anglais, langues nationales — niveau réel pour chacune</w:t>
+              <w:t>Exigé pour les postes de terrain</w:t>
+            </w:r>
+          </w:p>
+        </w:tc>
+        <w:tc>
+          <w:tcPr>
+            <w:tcW w:type="dxa" w:w="3324"/>
+            <w:shd w:val="clear" w:color="auto" w:fill="F2F7FB"/>
+            <w:tcBorders>
+              <w:top w:val="single" w:sz="4" w:space="0" w:color="BFBFBF"/>
+              <w:left w:val="single" w:sz="4" w:space="0" w:color="BFBFBF"/>
+              <w:bottom w:val="single" w:sz="4" w:space="0" w:color="BFBFBF"/>
+              <w:right w:val="single" w:sz="4" w:space="0" w:color="BFBFBF"/>
+            </w:tcBorders>
+          </w:tcPr>
+          <w:p>
+            <w:pPr>
+              <w:spacing w:after="40" w:before="40"/>
+            </w:pPr>
+            <w:r>
+              <w:rPr>
+                <w:b/>
+                <w:sz w:val="17"/>
+              </w:rPr>
+              <w:t>À confirmer</w:t>
             </w:r>
           </w:p>
         </w:tc>
@@ -1299,7 +2102,7 @@
       <w:tr>
         <w:tc>
           <w:tcPr>
-            <w:tcW w:type="dxa" w:w="4986"/>
+            <w:tcW w:type="dxa" w:w="3324"/>
             <w:shd w:val="clear" w:color="auto" w:fill="FFFFFF"/>
             <w:tcBorders>
               <w:top w:val="single" w:sz="4" w:space="0" w:color="BFBFBF"/>
@@ -1317,13 +2120,13 @@
                 <w:b w:val="0"/>
                 <w:sz w:val="17"/>
               </w:rPr>
-              <w:t>Publications / communications</w:t>
+              <w:t>Statut exact des expériences (stage académique vs contrat)</w:t>
             </w:r>
           </w:p>
         </w:tc>
         <w:tc>
           <w:tcPr>
-            <w:tcW w:type="dxa" w:w="4986"/>
+            <w:tcW w:type="dxa" w:w="3324"/>
             <w:shd w:val="clear" w:color="auto" w:fill="FFFFFF"/>
             <w:tcBorders>
               <w:top w:val="single" w:sz="4" w:space="0" w:color="BFBFBF"/>
@@ -1341,7 +2144,31 @@
                 <w:b w:val="0"/>
                 <w:sz w:val="17"/>
               </w:rPr>
-              <w:t>Le mémoire, communications orales, posters, rapports</w:t>
+              <w:t>Une expérience de stage ne doit jamais être présentée comme un emploi</w:t>
+            </w:r>
+          </w:p>
+        </w:tc>
+        <w:tc>
+          <w:tcPr>
+            <w:tcW w:type="dxa" w:w="3324"/>
+            <w:shd w:val="clear" w:color="auto" w:fill="FFFFFF"/>
+            <w:tcBorders>
+              <w:top w:val="single" w:sz="4" w:space="0" w:color="BFBFBF"/>
+              <w:left w:val="single" w:sz="4" w:space="0" w:color="BFBFBF"/>
+              <w:bottom w:val="single" w:sz="4" w:space="0" w:color="BFBFBF"/>
+              <w:right w:val="single" w:sz="4" w:space="0" w:color="BFBFBF"/>
+            </w:tcBorders>
+          </w:tcPr>
+          <w:p>
+            <w:pPr>
+              <w:spacing w:after="40" w:before="40"/>
+            </w:pPr>
+            <w:r>
+              <w:rPr>
+                <w:b w:val="0"/>
+                <w:sz w:val="17"/>
+              </w:rPr>
+              <w:t>Stage académique pour les 3 stages ; stage + fonctions administratives pour URMAPHA</w:t>
             </w:r>
           </w:p>
         </w:tc>
@@ -1349,7 +2176,7 @@
       <w:tr>
         <w:tc>
           <w:tcPr>
-            <w:tcW w:type="dxa" w:w="4986"/>
+            <w:tcW w:type="dxa" w:w="3324"/>
             <w:shd w:val="clear" w:color="auto" w:fill="F2F7FB"/>
             <w:tcBorders>
               <w:top w:val="single" w:sz="4" w:space="0" w:color="BFBFBF"/>
@@ -1367,13 +2194,13 @@
                 <w:b w:val="0"/>
                 <w:sz w:val="17"/>
               </w:rPr>
-              <w:t>Références</w:t>
+              <w:t>Nationalité / autorisation de travail</w:t>
             </w:r>
           </w:p>
         </w:tc>
         <w:tc>
           <w:tcPr>
-            <w:tcW w:type="dxa" w:w="4986"/>
+            <w:tcW w:type="dxa" w:w="3324"/>
             <w:shd w:val="clear" w:color="auto" w:fill="F2F7FB"/>
             <w:tcBorders>
               <w:top w:val="single" w:sz="4" w:space="0" w:color="BFBFBF"/>
@@ -1391,7 +2218,186 @@
                 <w:b w:val="0"/>
                 <w:sz w:val="17"/>
               </w:rPr>
-              <w:t>Personnes citées dans le mémoire (Pr AZANDJEME, M. TODEDJI, Dr METONNOU Clémence, Dr CHABI Chatine) — accord à confirmer</w:t>
+              <w:t>Éliminatoire pour les postes réservés aux ressortissants d'un pays</w:t>
+            </w:r>
+          </w:p>
+        </w:tc>
+        <w:tc>
+          <w:tcPr>
+            <w:tcW w:type="dxa" w:w="3324"/>
+            <w:shd w:val="clear" w:color="auto" w:fill="F2F7FB"/>
+            <w:tcBorders>
+              <w:top w:val="single" w:sz="4" w:space="0" w:color="BFBFBF"/>
+              <w:left w:val="single" w:sz="4" w:space="0" w:color="BFBFBF"/>
+              <w:bottom w:val="single" w:sz="4" w:space="0" w:color="BFBFBF"/>
+              <w:right w:val="single" w:sz="4" w:space="0" w:color="BFBFBF"/>
+            </w:tcBorders>
+          </w:tcPr>
+          <w:p>
+            <w:pPr>
+              <w:spacing w:after="40" w:before="40"/>
+            </w:pPr>
+            <w:r>
+              <w:rPr>
+                <w:b/>
+                <w:sz w:val="17"/>
+              </w:rPr>
+              <w:t>À confirmer</w:t>
+            </w:r>
+            <w:r>
+              <w:rPr>
+                <w:b w:val="0"/>
+                <w:sz w:val="17"/>
+              </w:rPr>
+              <w:t xml:space="preserve"> (présumée béninoise)</w:t>
+            </w:r>
+          </w:p>
+        </w:tc>
+      </w:tr>
+      <w:tr>
+        <w:tc>
+          <w:tcPr>
+            <w:tcW w:type="dxa" w:w="3324"/>
+            <w:shd w:val="clear" w:color="auto" w:fill="FFFFFF"/>
+            <w:tcBorders>
+              <w:top w:val="single" w:sz="4" w:space="0" w:color="BFBFBF"/>
+              <w:left w:val="single" w:sz="4" w:space="0" w:color="BFBFBF"/>
+              <w:bottom w:val="single" w:sz="4" w:space="0" w:color="BFBFBF"/>
+              <w:right w:val="single" w:sz="4" w:space="0" w:color="BFBFBF"/>
+            </w:tcBorders>
+          </w:tcPr>
+          <w:p>
+            <w:pPr>
+              <w:spacing w:after="40" w:before="40"/>
+            </w:pPr>
+            <w:r>
+              <w:rPr>
+                <w:b w:val="0"/>
+                <w:sz w:val="17"/>
+              </w:rPr>
+              <w:t>Disponibilité et préavis</w:t>
+            </w:r>
+          </w:p>
+        </w:tc>
+        <w:tc>
+          <w:tcPr>
+            <w:tcW w:type="dxa" w:w="3324"/>
+            <w:shd w:val="clear" w:color="auto" w:fill="FFFFFF"/>
+            <w:tcBorders>
+              <w:top w:val="single" w:sz="4" w:space="0" w:color="BFBFBF"/>
+              <w:left w:val="single" w:sz="4" w:space="0" w:color="BFBFBF"/>
+              <w:bottom w:val="single" w:sz="4" w:space="0" w:color="BFBFBF"/>
+              <w:right w:val="single" w:sz="4" w:space="0" w:color="BFBFBF"/>
+            </w:tcBorders>
+          </w:tcPr>
+          <w:p>
+            <w:pPr>
+              <w:spacing w:after="40" w:before="40"/>
+            </w:pPr>
+            <w:r>
+              <w:rPr>
+                <w:b w:val="0"/>
+                <w:sz w:val="17"/>
+              </w:rPr>
+              <w:t>Demandés dans la plupart des formulaires</w:t>
+            </w:r>
+          </w:p>
+        </w:tc>
+        <w:tc>
+          <w:tcPr>
+            <w:tcW w:type="dxa" w:w="3324"/>
+            <w:shd w:val="clear" w:color="auto" w:fill="FFFFFF"/>
+            <w:tcBorders>
+              <w:top w:val="single" w:sz="4" w:space="0" w:color="BFBFBF"/>
+              <w:left w:val="single" w:sz="4" w:space="0" w:color="BFBFBF"/>
+              <w:bottom w:val="single" w:sz="4" w:space="0" w:color="BFBFBF"/>
+              <w:right w:val="single" w:sz="4" w:space="0" w:color="BFBFBF"/>
+            </w:tcBorders>
+          </w:tcPr>
+          <w:p>
+            <w:pPr>
+              <w:spacing w:after="40" w:before="40"/>
+            </w:pPr>
+            <w:r>
+              <w:rPr>
+                <w:b/>
+                <w:sz w:val="17"/>
+              </w:rPr>
+              <w:t>À confirmer</w:t>
+            </w:r>
+          </w:p>
+        </w:tc>
+      </w:tr>
+      <w:tr>
+        <w:tc>
+          <w:tcPr>
+            <w:tcW w:type="dxa" w:w="3324"/>
+            <w:shd w:val="clear" w:color="auto" w:fill="F2F7FB"/>
+            <w:tcBorders>
+              <w:top w:val="single" w:sz="4" w:space="0" w:color="BFBFBF"/>
+              <w:left w:val="single" w:sz="4" w:space="0" w:color="BFBFBF"/>
+              <w:bottom w:val="single" w:sz="4" w:space="0" w:color="BFBFBF"/>
+              <w:right w:val="single" w:sz="4" w:space="0" w:color="BFBFBF"/>
+            </w:tcBorders>
+          </w:tcPr>
+          <w:p>
+            <w:pPr>
+              <w:spacing w:after="40" w:before="40"/>
+            </w:pPr>
+            <w:r>
+              <w:rPr>
+                <w:b w:val="0"/>
+                <w:sz w:val="17"/>
+              </w:rPr>
+              <w:t>Prétentions salariales</w:t>
+            </w:r>
+          </w:p>
+        </w:tc>
+        <w:tc>
+          <w:tcPr>
+            <w:tcW w:type="dxa" w:w="3324"/>
+            <w:shd w:val="clear" w:color="auto" w:fill="F2F7FB"/>
+            <w:tcBorders>
+              <w:top w:val="single" w:sz="4" w:space="0" w:color="BFBFBF"/>
+              <w:left w:val="single" w:sz="4" w:space="0" w:color="BFBFBF"/>
+              <w:bottom w:val="single" w:sz="4" w:space="0" w:color="BFBFBF"/>
+              <w:right w:val="single" w:sz="4" w:space="0" w:color="BFBFBF"/>
+            </w:tcBorders>
+          </w:tcPr>
+          <w:p>
+            <w:pPr>
+              <w:spacing w:after="40" w:before="40"/>
+            </w:pPr>
+            <w:r>
+              <w:rPr>
+                <w:b w:val="0"/>
+                <w:sz w:val="17"/>
+              </w:rPr>
+              <w:t>Demandées par plusieurs annonces (AbT-E, etc.)</w:t>
+            </w:r>
+          </w:p>
+        </w:tc>
+        <w:tc>
+          <w:tcPr>
+            <w:tcW w:type="dxa" w:w="3324"/>
+            <w:shd w:val="clear" w:color="auto" w:fill="F2F7FB"/>
+            <w:tcBorders>
+              <w:top w:val="single" w:sz="4" w:space="0" w:color="BFBFBF"/>
+              <w:left w:val="single" w:sz="4" w:space="0" w:color="BFBFBF"/>
+              <w:bottom w:val="single" w:sz="4" w:space="0" w:color="BFBFBF"/>
+              <w:right w:val="single" w:sz="4" w:space="0" w:color="BFBFBF"/>
+            </w:tcBorders>
+          </w:tcPr>
+          <w:p>
+            <w:pPr>
+              <w:spacing w:after="40" w:before="40"/>
+            </w:pPr>
+            <w:r>
+              <w:rPr>
+                <w:b/>
+                <w:sz w:val="17"/>
+              </w:rPr>
+              <w:t>À confirmer</w:t>
             </w:r>
           </w:p>
         </w:tc>
@@ -1406,7 +2412,7 @@
         <w:rPr>
           <w:b w:val="0"/>
         </w:rPr>
-        <w:t>1.3 Projet professionnel (ta formulation, à reprendre telle quelle)</w:t>
+        <w:t>1.4 Projet professionnel (ta formulation, à reprendre telle quelle)</w:t>
       </w:r>
     </w:p>
     <w:p>
@@ -1467,7 +2473,7 @@
         <w:rPr>
           <w:b w:val="0"/>
         </w:rPr>
-        <w:t>1.4 Règle absolue (non négociable)</w:t>
+        <w:t>1.5 Règle absolue (non négociable)</w:t>
       </w:r>
     </w:p>
     <w:p>

</xml_diff>

<commit_message>
Dossier de candidature FAO : programme de stage pour l'Afrique (2601980)
Co-authored-by: arena-agent <297053741+arena-agent@users.noreply.github.com>
</commit_message>
<xml_diff>
--- a/Prompts de référence.docx
+++ b/Prompts de référence.docx
@@ -1965,7 +1965,7 @@
                 <w:b w:val="0"/>
                 <w:sz w:val="17"/>
               </w:rPr>
-              <w:t>Langues nationales (fon, goun, aja…)</w:t>
+              <w:t>Langues nationales</w:t>
             </w:r>
           </w:p>
         </w:tc>
@@ -2013,14 +2013,14 @@
                 <w:b/>
                 <w:sz w:val="17"/>
               </w:rPr>
-              <w:t>À confirmer</w:t>
+              <w:t>Confirmé : fon, goun</w:t>
             </w:r>
             <w:r>
               <w:rPr>
                 <w:b w:val="0"/>
                 <w:sz w:val="17"/>
               </w:rPr>
-              <w:t xml:space="preserve"> — ne rien écrire sans réponse</w:t>
+              <w:t xml:space="preserve"> (parlé couramment)</w:t>
             </w:r>
           </w:p>
         </w:tc>
@@ -2046,7 +2046,7 @@
                 <w:b w:val="0"/>
                 <w:sz w:val="17"/>
               </w:rPr>
-              <w:t>Permis de conduire / mobilité terrain</w:t>
+              <w:t>Permis de conduire</w:t>
             </w:r>
           </w:p>
         </w:tc>
@@ -2071,6 +2071,316 @@
                 <w:sz w:val="17"/>
               </w:rPr>
               <w:t>Exigé pour les postes de terrain</w:t>
+            </w:r>
+          </w:p>
+        </w:tc>
+        <w:tc>
+          <w:tcPr>
+            <w:tcW w:type="dxa" w:w="3324"/>
+            <w:shd w:val="clear" w:color="auto" w:fill="F2F7FB"/>
+            <w:tcBorders>
+              <w:top w:val="single" w:sz="4" w:space="0" w:color="BFBFBF"/>
+              <w:left w:val="single" w:sz="4" w:space="0" w:color="BFBFBF"/>
+              <w:bottom w:val="single" w:sz="4" w:space="0" w:color="BFBFBF"/>
+              <w:right w:val="single" w:sz="4" w:space="0" w:color="BFBFBF"/>
+            </w:tcBorders>
+          </w:tcPr>
+          <w:p>
+            <w:pPr>
+              <w:spacing w:after="40" w:before="40"/>
+            </w:pPr>
+            <w:r>
+              <w:rPr>
+                <w:b/>
+                <w:sz w:val="17"/>
+              </w:rPr>
+              <w:t>Confirmé : permis B, sans véhicule personnel</w:t>
+            </w:r>
+            <w:r>
+              <w:rPr>
+                <w:b w:val="0"/>
+                <w:sz w:val="17"/>
+              </w:rPr>
+              <w:t xml:space="preserve"> — ne jamais mentionner de véhicule</w:t>
+            </w:r>
+          </w:p>
+        </w:tc>
+      </w:tr>
+      <w:tr>
+        <w:tc>
+          <w:tcPr>
+            <w:tcW w:type="dxa" w:w="3324"/>
+            <w:shd w:val="clear" w:color="auto" w:fill="FFFFFF"/>
+            <w:tcBorders>
+              <w:top w:val="single" w:sz="4" w:space="0" w:color="BFBFBF"/>
+              <w:left w:val="single" w:sz="4" w:space="0" w:color="BFBFBF"/>
+              <w:bottom w:val="single" w:sz="4" w:space="0" w:color="BFBFBF"/>
+              <w:right w:val="single" w:sz="4" w:space="0" w:color="BFBFBF"/>
+            </w:tcBorders>
+          </w:tcPr>
+          <w:p>
+            <w:pPr>
+              <w:spacing w:after="40" w:before="40"/>
+            </w:pPr>
+            <w:r>
+              <w:rPr>
+                <w:b w:val="0"/>
+                <w:sz w:val="17"/>
+              </w:rPr>
+              <w:t>Date de naissance / âge</w:t>
+            </w:r>
+          </w:p>
+        </w:tc>
+        <w:tc>
+          <w:tcPr>
+            <w:tcW w:type="dxa" w:w="3324"/>
+            <w:shd w:val="clear" w:color="auto" w:fill="FFFFFF"/>
+            <w:tcBorders>
+              <w:top w:val="single" w:sz="4" w:space="0" w:color="BFBFBF"/>
+              <w:left w:val="single" w:sz="4" w:space="0" w:color="BFBFBF"/>
+              <w:bottom w:val="single" w:sz="4" w:space="0" w:color="BFBFBF"/>
+              <w:right w:val="single" w:sz="4" w:space="0" w:color="BFBFBF"/>
+            </w:tcBorders>
+          </w:tcPr>
+          <w:p>
+            <w:pPr>
+              <w:spacing w:after="40" w:before="40"/>
+            </w:pPr>
+            <w:r>
+              <w:rPr>
+                <w:b w:val="0"/>
+                <w:sz w:val="17"/>
+              </w:rPr>
+              <w:t>Critère éliminatoire pour les programmes « jeunes » (ex. FAO : 21-30 ans)</w:t>
+            </w:r>
+          </w:p>
+        </w:tc>
+        <w:tc>
+          <w:tcPr>
+            <w:tcW w:type="dxa" w:w="3324"/>
+            <w:shd w:val="clear" w:color="auto" w:fill="FFFFFF"/>
+            <w:tcBorders>
+              <w:top w:val="single" w:sz="4" w:space="0" w:color="BFBFBF"/>
+              <w:left w:val="single" w:sz="4" w:space="0" w:color="BFBFBF"/>
+              <w:bottom w:val="single" w:sz="4" w:space="0" w:color="BFBFBF"/>
+              <w:right w:val="single" w:sz="4" w:space="0" w:color="BFBFBF"/>
+            </w:tcBorders>
+          </w:tcPr>
+          <w:p>
+            <w:pPr>
+              <w:spacing w:after="40" w:before="40"/>
+            </w:pPr>
+            <w:r>
+              <w:rPr>
+                <w:b/>
+                <w:sz w:val="17"/>
+              </w:rPr>
+              <w:t>À confirmer</w:t>
+            </w:r>
+          </w:p>
+        </w:tc>
+      </w:tr>
+      <w:tr>
+        <w:tc>
+          <w:tcPr>
+            <w:tcW w:type="dxa" w:w="3324"/>
+            <w:shd w:val="clear" w:color="auto" w:fill="F2F7FB"/>
+            <w:tcBorders>
+              <w:top w:val="single" w:sz="4" w:space="0" w:color="BFBFBF"/>
+              <w:left w:val="single" w:sz="4" w:space="0" w:color="BFBFBF"/>
+              <w:bottom w:val="single" w:sz="4" w:space="0" w:color="BFBFBF"/>
+              <w:right w:val="single" w:sz="4" w:space="0" w:color="BFBFBF"/>
+            </w:tcBorders>
+          </w:tcPr>
+          <w:p>
+            <w:pPr>
+              <w:spacing w:after="40" w:before="40"/>
+            </w:pPr>
+            <w:r>
+              <w:rPr>
+                <w:b w:val="0"/>
+                <w:sz w:val="17"/>
+              </w:rPr>
+              <w:t>Statut exact des expériences (stage académique vs contrat)</w:t>
+            </w:r>
+          </w:p>
+        </w:tc>
+        <w:tc>
+          <w:tcPr>
+            <w:tcW w:type="dxa" w:w="3324"/>
+            <w:shd w:val="clear" w:color="auto" w:fill="F2F7FB"/>
+            <w:tcBorders>
+              <w:top w:val="single" w:sz="4" w:space="0" w:color="BFBFBF"/>
+              <w:left w:val="single" w:sz="4" w:space="0" w:color="BFBFBF"/>
+              <w:bottom w:val="single" w:sz="4" w:space="0" w:color="BFBFBF"/>
+              <w:right w:val="single" w:sz="4" w:space="0" w:color="BFBFBF"/>
+            </w:tcBorders>
+          </w:tcPr>
+          <w:p>
+            <w:pPr>
+              <w:spacing w:after="40" w:before="40"/>
+            </w:pPr>
+            <w:r>
+              <w:rPr>
+                <w:b w:val="0"/>
+                <w:sz w:val="17"/>
+              </w:rPr>
+              <w:t>Une expérience de stage ne doit jamais être présentée comme un emploi</w:t>
+            </w:r>
+          </w:p>
+        </w:tc>
+        <w:tc>
+          <w:tcPr>
+            <w:tcW w:type="dxa" w:w="3324"/>
+            <w:shd w:val="clear" w:color="auto" w:fill="F2F7FB"/>
+            <w:tcBorders>
+              <w:top w:val="single" w:sz="4" w:space="0" w:color="BFBFBF"/>
+              <w:left w:val="single" w:sz="4" w:space="0" w:color="BFBFBF"/>
+              <w:bottom w:val="single" w:sz="4" w:space="0" w:color="BFBFBF"/>
+              <w:right w:val="single" w:sz="4" w:space="0" w:color="BFBFBF"/>
+            </w:tcBorders>
+          </w:tcPr>
+          <w:p>
+            <w:pPr>
+              <w:spacing w:after="40" w:before="40"/>
+            </w:pPr>
+            <w:r>
+              <w:rPr>
+                <w:b w:val="0"/>
+                <w:sz w:val="17"/>
+              </w:rPr>
+              <w:t>Stage académique pour les 3 stages ; stage + fonctions administratives pour URMAPHA</w:t>
+            </w:r>
+          </w:p>
+        </w:tc>
+      </w:tr>
+      <w:tr>
+        <w:tc>
+          <w:tcPr>
+            <w:tcW w:type="dxa" w:w="3324"/>
+            <w:shd w:val="clear" w:color="auto" w:fill="FFFFFF"/>
+            <w:tcBorders>
+              <w:top w:val="single" w:sz="4" w:space="0" w:color="BFBFBF"/>
+              <w:left w:val="single" w:sz="4" w:space="0" w:color="BFBFBF"/>
+              <w:bottom w:val="single" w:sz="4" w:space="0" w:color="BFBFBF"/>
+              <w:right w:val="single" w:sz="4" w:space="0" w:color="BFBFBF"/>
+            </w:tcBorders>
+          </w:tcPr>
+          <w:p>
+            <w:pPr>
+              <w:spacing w:after="40" w:before="40"/>
+            </w:pPr>
+            <w:r>
+              <w:rPr>
+                <w:b w:val="0"/>
+                <w:sz w:val="17"/>
+              </w:rPr>
+              <w:t>Nationalité / autorisation de travail</w:t>
+            </w:r>
+          </w:p>
+        </w:tc>
+        <w:tc>
+          <w:tcPr>
+            <w:tcW w:type="dxa" w:w="3324"/>
+            <w:shd w:val="clear" w:color="auto" w:fill="FFFFFF"/>
+            <w:tcBorders>
+              <w:top w:val="single" w:sz="4" w:space="0" w:color="BFBFBF"/>
+              <w:left w:val="single" w:sz="4" w:space="0" w:color="BFBFBF"/>
+              <w:bottom w:val="single" w:sz="4" w:space="0" w:color="BFBFBF"/>
+              <w:right w:val="single" w:sz="4" w:space="0" w:color="BFBFBF"/>
+            </w:tcBorders>
+          </w:tcPr>
+          <w:p>
+            <w:pPr>
+              <w:spacing w:after="40" w:before="40"/>
+            </w:pPr>
+            <w:r>
+              <w:rPr>
+                <w:b w:val="0"/>
+                <w:sz w:val="17"/>
+              </w:rPr>
+              <w:t>Éliminatoire pour les postes réservés aux ressortissants d'un pays</w:t>
+            </w:r>
+          </w:p>
+        </w:tc>
+        <w:tc>
+          <w:tcPr>
+            <w:tcW w:type="dxa" w:w="3324"/>
+            <w:shd w:val="clear" w:color="auto" w:fill="FFFFFF"/>
+            <w:tcBorders>
+              <w:top w:val="single" w:sz="4" w:space="0" w:color="BFBFBF"/>
+              <w:left w:val="single" w:sz="4" w:space="0" w:color="BFBFBF"/>
+              <w:bottom w:val="single" w:sz="4" w:space="0" w:color="BFBFBF"/>
+              <w:right w:val="single" w:sz="4" w:space="0" w:color="BFBFBF"/>
+            </w:tcBorders>
+          </w:tcPr>
+          <w:p>
+            <w:pPr>
+              <w:spacing w:after="40" w:before="40"/>
+            </w:pPr>
+            <w:r>
+              <w:rPr>
+                <w:b/>
+                <w:sz w:val="17"/>
+              </w:rPr>
+              <w:t>À confirmer</w:t>
+            </w:r>
+            <w:r>
+              <w:rPr>
+                <w:b w:val="0"/>
+                <w:sz w:val="17"/>
+              </w:rPr>
+              <w:t xml:space="preserve"> (présumée béninoise)</w:t>
+            </w:r>
+          </w:p>
+        </w:tc>
+      </w:tr>
+      <w:tr>
+        <w:tc>
+          <w:tcPr>
+            <w:tcW w:type="dxa" w:w="3324"/>
+            <w:shd w:val="clear" w:color="auto" w:fill="F2F7FB"/>
+            <w:tcBorders>
+              <w:top w:val="single" w:sz="4" w:space="0" w:color="BFBFBF"/>
+              <w:left w:val="single" w:sz="4" w:space="0" w:color="BFBFBF"/>
+              <w:bottom w:val="single" w:sz="4" w:space="0" w:color="BFBFBF"/>
+              <w:right w:val="single" w:sz="4" w:space="0" w:color="BFBFBF"/>
+            </w:tcBorders>
+          </w:tcPr>
+          <w:p>
+            <w:pPr>
+              <w:spacing w:after="40" w:before="40"/>
+            </w:pPr>
+            <w:r>
+              <w:rPr>
+                <w:b w:val="0"/>
+                <w:sz w:val="17"/>
+              </w:rPr>
+              <w:t>Disponibilité et préavis</w:t>
+            </w:r>
+          </w:p>
+        </w:tc>
+        <w:tc>
+          <w:tcPr>
+            <w:tcW w:type="dxa" w:w="3324"/>
+            <w:shd w:val="clear" w:color="auto" w:fill="F2F7FB"/>
+            <w:tcBorders>
+              <w:top w:val="single" w:sz="4" w:space="0" w:color="BFBFBF"/>
+              <w:left w:val="single" w:sz="4" w:space="0" w:color="BFBFBF"/>
+              <w:bottom w:val="single" w:sz="4" w:space="0" w:color="BFBFBF"/>
+              <w:right w:val="single" w:sz="4" w:space="0" w:color="BFBFBF"/>
+            </w:tcBorders>
+          </w:tcPr>
+          <w:p>
+            <w:pPr>
+              <w:spacing w:after="40" w:before="40"/>
+            </w:pPr>
+            <w:r>
+              <w:rPr>
+                <w:b w:val="0"/>
+                <w:sz w:val="17"/>
+              </w:rPr>
+              <w:t>Demandés dans la plupart des formulaires</w:t>
             </w:r>
           </w:p>
         </w:tc>
@@ -2120,7 +2430,7 @@
                 <w:b w:val="0"/>
                 <w:sz w:val="17"/>
               </w:rPr>
-              <w:t>Statut exact des expériences (stage académique vs contrat)</w:t>
+              <w:t>Prétentions salariales</w:t>
             </w:r>
           </w:p>
         </w:tc>
@@ -2144,7 +2454,7 @@
                 <w:b w:val="0"/>
                 <w:sz w:val="17"/>
               </w:rPr>
-              <w:t>Une expérience de stage ne doit jamais être présentée comme un emploi</w:t>
+              <w:t>Demandées par plusieurs annonces (AbT-E, etc.)</w:t>
             </w:r>
           </w:p>
         </w:tc>
@@ -2152,235 +2462,6 @@
           <w:tcPr>
             <w:tcW w:type="dxa" w:w="3324"/>
             <w:shd w:val="clear" w:color="auto" w:fill="FFFFFF"/>
-            <w:tcBorders>
-              <w:top w:val="single" w:sz="4" w:space="0" w:color="BFBFBF"/>
-              <w:left w:val="single" w:sz="4" w:space="0" w:color="BFBFBF"/>
-              <w:bottom w:val="single" w:sz="4" w:space="0" w:color="BFBFBF"/>
-              <w:right w:val="single" w:sz="4" w:space="0" w:color="BFBFBF"/>
-            </w:tcBorders>
-          </w:tcPr>
-          <w:p>
-            <w:pPr>
-              <w:spacing w:after="40" w:before="40"/>
-            </w:pPr>
-            <w:r>
-              <w:rPr>
-                <w:b w:val="0"/>
-                <w:sz w:val="17"/>
-              </w:rPr>
-              <w:t>Stage académique pour les 3 stages ; stage + fonctions administratives pour URMAPHA</w:t>
-            </w:r>
-          </w:p>
-        </w:tc>
-      </w:tr>
-      <w:tr>
-        <w:tc>
-          <w:tcPr>
-            <w:tcW w:type="dxa" w:w="3324"/>
-            <w:shd w:val="clear" w:color="auto" w:fill="F2F7FB"/>
-            <w:tcBorders>
-              <w:top w:val="single" w:sz="4" w:space="0" w:color="BFBFBF"/>
-              <w:left w:val="single" w:sz="4" w:space="0" w:color="BFBFBF"/>
-              <w:bottom w:val="single" w:sz="4" w:space="0" w:color="BFBFBF"/>
-              <w:right w:val="single" w:sz="4" w:space="0" w:color="BFBFBF"/>
-            </w:tcBorders>
-          </w:tcPr>
-          <w:p>
-            <w:pPr>
-              <w:spacing w:after="40" w:before="40"/>
-            </w:pPr>
-            <w:r>
-              <w:rPr>
-                <w:b w:val="0"/>
-                <w:sz w:val="17"/>
-              </w:rPr>
-              <w:t>Nationalité / autorisation de travail</w:t>
-            </w:r>
-          </w:p>
-        </w:tc>
-        <w:tc>
-          <w:tcPr>
-            <w:tcW w:type="dxa" w:w="3324"/>
-            <w:shd w:val="clear" w:color="auto" w:fill="F2F7FB"/>
-            <w:tcBorders>
-              <w:top w:val="single" w:sz="4" w:space="0" w:color="BFBFBF"/>
-              <w:left w:val="single" w:sz="4" w:space="0" w:color="BFBFBF"/>
-              <w:bottom w:val="single" w:sz="4" w:space="0" w:color="BFBFBF"/>
-              <w:right w:val="single" w:sz="4" w:space="0" w:color="BFBFBF"/>
-            </w:tcBorders>
-          </w:tcPr>
-          <w:p>
-            <w:pPr>
-              <w:spacing w:after="40" w:before="40"/>
-            </w:pPr>
-            <w:r>
-              <w:rPr>
-                <w:b w:val="0"/>
-                <w:sz w:val="17"/>
-              </w:rPr>
-              <w:t>Éliminatoire pour les postes réservés aux ressortissants d'un pays</w:t>
-            </w:r>
-          </w:p>
-        </w:tc>
-        <w:tc>
-          <w:tcPr>
-            <w:tcW w:type="dxa" w:w="3324"/>
-            <w:shd w:val="clear" w:color="auto" w:fill="F2F7FB"/>
-            <w:tcBorders>
-              <w:top w:val="single" w:sz="4" w:space="0" w:color="BFBFBF"/>
-              <w:left w:val="single" w:sz="4" w:space="0" w:color="BFBFBF"/>
-              <w:bottom w:val="single" w:sz="4" w:space="0" w:color="BFBFBF"/>
-              <w:right w:val="single" w:sz="4" w:space="0" w:color="BFBFBF"/>
-            </w:tcBorders>
-          </w:tcPr>
-          <w:p>
-            <w:pPr>
-              <w:spacing w:after="40" w:before="40"/>
-            </w:pPr>
-            <w:r>
-              <w:rPr>
-                <w:b/>
-                <w:sz w:val="17"/>
-              </w:rPr>
-              <w:t>À confirmer</w:t>
-            </w:r>
-            <w:r>
-              <w:rPr>
-                <w:b w:val="0"/>
-                <w:sz w:val="17"/>
-              </w:rPr>
-              <w:t xml:space="preserve"> (présumée béninoise)</w:t>
-            </w:r>
-          </w:p>
-        </w:tc>
-      </w:tr>
-      <w:tr>
-        <w:tc>
-          <w:tcPr>
-            <w:tcW w:type="dxa" w:w="3324"/>
-            <w:shd w:val="clear" w:color="auto" w:fill="FFFFFF"/>
-            <w:tcBorders>
-              <w:top w:val="single" w:sz="4" w:space="0" w:color="BFBFBF"/>
-              <w:left w:val="single" w:sz="4" w:space="0" w:color="BFBFBF"/>
-              <w:bottom w:val="single" w:sz="4" w:space="0" w:color="BFBFBF"/>
-              <w:right w:val="single" w:sz="4" w:space="0" w:color="BFBFBF"/>
-            </w:tcBorders>
-          </w:tcPr>
-          <w:p>
-            <w:pPr>
-              <w:spacing w:after="40" w:before="40"/>
-            </w:pPr>
-            <w:r>
-              <w:rPr>
-                <w:b w:val="0"/>
-                <w:sz w:val="17"/>
-              </w:rPr>
-              <w:t>Disponibilité et préavis</w:t>
-            </w:r>
-          </w:p>
-        </w:tc>
-        <w:tc>
-          <w:tcPr>
-            <w:tcW w:type="dxa" w:w="3324"/>
-            <w:shd w:val="clear" w:color="auto" w:fill="FFFFFF"/>
-            <w:tcBorders>
-              <w:top w:val="single" w:sz="4" w:space="0" w:color="BFBFBF"/>
-              <w:left w:val="single" w:sz="4" w:space="0" w:color="BFBFBF"/>
-              <w:bottom w:val="single" w:sz="4" w:space="0" w:color="BFBFBF"/>
-              <w:right w:val="single" w:sz="4" w:space="0" w:color="BFBFBF"/>
-            </w:tcBorders>
-          </w:tcPr>
-          <w:p>
-            <w:pPr>
-              <w:spacing w:after="40" w:before="40"/>
-            </w:pPr>
-            <w:r>
-              <w:rPr>
-                <w:b w:val="0"/>
-                <w:sz w:val="17"/>
-              </w:rPr>
-              <w:t>Demandés dans la plupart des formulaires</w:t>
-            </w:r>
-          </w:p>
-        </w:tc>
-        <w:tc>
-          <w:tcPr>
-            <w:tcW w:type="dxa" w:w="3324"/>
-            <w:shd w:val="clear" w:color="auto" w:fill="FFFFFF"/>
-            <w:tcBorders>
-              <w:top w:val="single" w:sz="4" w:space="0" w:color="BFBFBF"/>
-              <w:left w:val="single" w:sz="4" w:space="0" w:color="BFBFBF"/>
-              <w:bottom w:val="single" w:sz="4" w:space="0" w:color="BFBFBF"/>
-              <w:right w:val="single" w:sz="4" w:space="0" w:color="BFBFBF"/>
-            </w:tcBorders>
-          </w:tcPr>
-          <w:p>
-            <w:pPr>
-              <w:spacing w:after="40" w:before="40"/>
-            </w:pPr>
-            <w:r>
-              <w:rPr>
-                <w:b/>
-                <w:sz w:val="17"/>
-              </w:rPr>
-              <w:t>À confirmer</w:t>
-            </w:r>
-          </w:p>
-        </w:tc>
-      </w:tr>
-      <w:tr>
-        <w:tc>
-          <w:tcPr>
-            <w:tcW w:type="dxa" w:w="3324"/>
-            <w:shd w:val="clear" w:color="auto" w:fill="F2F7FB"/>
-            <w:tcBorders>
-              <w:top w:val="single" w:sz="4" w:space="0" w:color="BFBFBF"/>
-              <w:left w:val="single" w:sz="4" w:space="0" w:color="BFBFBF"/>
-              <w:bottom w:val="single" w:sz="4" w:space="0" w:color="BFBFBF"/>
-              <w:right w:val="single" w:sz="4" w:space="0" w:color="BFBFBF"/>
-            </w:tcBorders>
-          </w:tcPr>
-          <w:p>
-            <w:pPr>
-              <w:spacing w:after="40" w:before="40"/>
-            </w:pPr>
-            <w:r>
-              <w:rPr>
-                <w:b w:val="0"/>
-                <w:sz w:val="17"/>
-              </w:rPr>
-              <w:t>Prétentions salariales</w:t>
-            </w:r>
-          </w:p>
-        </w:tc>
-        <w:tc>
-          <w:tcPr>
-            <w:tcW w:type="dxa" w:w="3324"/>
-            <w:shd w:val="clear" w:color="auto" w:fill="F2F7FB"/>
-            <w:tcBorders>
-              <w:top w:val="single" w:sz="4" w:space="0" w:color="BFBFBF"/>
-              <w:left w:val="single" w:sz="4" w:space="0" w:color="BFBFBF"/>
-              <w:bottom w:val="single" w:sz="4" w:space="0" w:color="BFBFBF"/>
-              <w:right w:val="single" w:sz="4" w:space="0" w:color="BFBFBF"/>
-            </w:tcBorders>
-          </w:tcPr>
-          <w:p>
-            <w:pPr>
-              <w:spacing w:after="40" w:before="40"/>
-            </w:pPr>
-            <w:r>
-              <w:rPr>
-                <w:b w:val="0"/>
-                <w:sz w:val="17"/>
-              </w:rPr>
-              <w:t>Demandées par plusieurs annonces (AbT-E, etc.)</w:t>
-            </w:r>
-          </w:p>
-        </w:tc>
-        <w:tc>
-          <w:tcPr>
-            <w:tcW w:type="dxa" w:w="3324"/>
-            <w:shd w:val="clear" w:color="auto" w:fill="F2F7FB"/>
             <w:tcBorders>
               <w:top w:val="single" w:sz="4" w:space="0" w:color="BFBFBF"/>
               <w:left w:val="single" w:sz="4" w:space="0" w:color="BFBFBF"/>

</xml_diff>